<commit_message>
Ensure deterministic placement across hash seeds, re-run experiments, and auto-generate report tables
</commit_message>
<xml_diff>
--- a/report/TECHNICAL_REPORT.docx
+++ b/report/TECHNICAL_REPORT.docx
@@ -9902,7 +9902,7 @@
                 <m:rPr>
                   <m:sty m:val="p"/>
                 </m:rPr>
-                <m:t>∥</m:t>
+                <m:t>|</m:t>
               </m:r>
               <m:r>
                 <m:t>V</m:t>
@@ -9911,7 +9911,7 @@
                 <m:rPr>
                   <m:sty m:val="p"/>
                 </m:rPr>
-                <m:t>∥</m:t>
+                <m:t>|</m:t>
               </m:r>
             </m:oMath>
           </w:p>
@@ -9934,7 +9934,7 @@
                 <m:rPr>
                   <m:sty m:val="p"/>
                 </m:rPr>
-                <m:t>∥</m:t>
+                <m:t>|</m:t>
               </m:r>
               <m:r>
                 <m:t>E</m:t>
@@ -9943,7 +9943,7 @@
                 <m:rPr>
                   <m:sty m:val="p"/>
                 </m:rPr>
-                <m:t>∥</m:t>
+                <m:t>|</m:t>
               </m:r>
             </m:oMath>
           </w:p>
@@ -9990,7 +9990,7 @@
                 <m:rPr>
                   <m:sty m:val="p"/>
                 </m:rPr>
-                <m:t>∥</m:t>
+                <m:t>|</m:t>
               </m:r>
               <m:r>
                 <m:t>E</m:t>
@@ -9999,7 +9999,7 @@
                 <m:rPr>
                   <m:sty m:val="p"/>
                 </m:rPr>
-                <m:t>∥</m:t>
+                <m:t>|</m:t>
               </m:r>
             </m:oMath>
           </w:p>
@@ -10101,7 +10101,7 @@
             </w:pPr>
             <m:oMath>
               <m:r>
-                <m:t>0.026</m:t>
+                <m:t>0.025</m:t>
               </m:r>
               <m:r>
                 <m:rPr>
@@ -10148,7 +10148,7 @@
                 <m:t>±</m:t>
               </m:r>
               <m:r>
-                <m:t>0.002</m:t>
+                <m:t>0.003</m:t>
               </m:r>
             </m:oMath>
             <w:r>
@@ -10165,7 +10165,7 @@
             </w:pPr>
             <m:oMath>
               <m:r>
-                <m:t>0.030</m:t>
+                <m:t>0.031</m:t>
               </m:r>
               <m:r>
                 <m:rPr>
@@ -10174,7 +10174,7 @@
                 <m:t>±</m:t>
               </m:r>
               <m:r>
-                <m:t>0.002</m:t>
+                <m:t>0.003</m:t>
               </m:r>
             </m:oMath>
             <w:r>
@@ -10190,7 +10190,7 @@
               <w:jc w:val="center"/>
             </w:pPr>
             <w:r>
-              <w:t xml:space="preserve">Prim 0.60x</w:t>
+              <w:t xml:space="preserve">Prim 0.58x</w:t>
             </w:r>
           </w:p>
         </w:tc>
@@ -10229,7 +10229,7 @@
             </w:pPr>
             <m:oMath>
               <m:r>
-                <m:t>0.110</m:t>
+                <m:t>0.112</m:t>
               </m:r>
               <m:r>
                 <m:rPr>
@@ -10238,7 +10238,7 @@
                 <m:t>±</m:t>
               </m:r>
               <m:r>
-                <m:t>0.007</m:t>
+                <m:t>0.008</m:t>
               </m:r>
             </m:oMath>
             <w:r>
@@ -10255,7 +10255,7 @@
             </w:pPr>
             <m:oMath>
               <m:r>
-                <m:t>0.218</m:t>
+                <m:t>0.220</m:t>
               </m:r>
               <m:r>
                 <m:rPr>
@@ -10264,7 +10264,7 @@
                 <m:t>±</m:t>
               </m:r>
               <m:r>
-                <m:t>0.005</m:t>
+                <m:t>0.003</m:t>
               </m:r>
             </m:oMath>
             <w:r>
@@ -10293,7 +10293,7 @@
             </w:pPr>
             <m:oMath>
               <m:r>
-                <m:t>0.315</m:t>
+                <m:t>0.339</m:t>
               </m:r>
               <m:r>
                 <m:rPr>
@@ -10302,7 +10302,7 @@
                 <m:t>±</m:t>
               </m:r>
               <m:r>
-                <m:t>0.029</m:t>
+                <m:t>0.036</m:t>
               </m:r>
             </m:oMath>
             <w:r>
@@ -10319,7 +10319,7 @@
             </w:pPr>
             <m:oMath>
               <m:r>
-                <m:t>0.314</m:t>
+                <m:t>0.315</m:t>
               </m:r>
               <m:r>
                 <m:rPr>
@@ -10328,7 +10328,7 @@
                 <m:t>±</m:t>
               </m:r>
               <m:r>
-                <m:t>0.005</m:t>
+                <m:t>0.009</m:t>
               </m:r>
             </m:oMath>
             <w:r>
@@ -10348,7 +10348,7 @@
                 <w:b/>
                 <w:bCs/>
               </w:rPr>
-              <w:t xml:space="preserve">Crossover (1.0x)</w:t>
+              <w:t xml:space="preserve">Crossover (1.08x)</w:t>
             </w:r>
           </w:p>
         </w:tc>
@@ -10387,7 +10387,7 @@
             </w:pPr>
             <m:oMath>
               <m:r>
-                <m:t>0.426</m:t>
+                <m:t>0.430</m:t>
               </m:r>
               <m:r>
                 <m:rPr>
@@ -10396,7 +10396,7 @@
                 <m:t>±</m:t>
               </m:r>
               <m:r>
-                <m:t>0.030</m:t>
+                <m:t>0.038</m:t>
               </m:r>
             </m:oMath>
             <w:r>
@@ -10413,7 +10413,7 @@
             </w:pPr>
             <m:oMath>
               <m:r>
-                <m:t>0.569</m:t>
+                <m:t>0.572</m:t>
               </m:r>
               <m:r>
                 <m:rPr>
@@ -10422,7 +10422,7 @@
                 <m:t>±</m:t>
               </m:r>
               <m:r>
-                <m:t>0.016</m:t>
+                <m:t>0.022</m:t>
               </m:r>
             </m:oMath>
             <w:r>
@@ -10451,7 +10451,7 @@
             </w:pPr>
             <m:oMath>
               <m:r>
-                <m:t>1.537</m:t>
+                <m:t>1.674</m:t>
               </m:r>
               <m:r>
                 <m:rPr>
@@ -10460,7 +10460,7 @@
                 <m:t>±</m:t>
               </m:r>
               <m:r>
-                <m:t>0.137</m:t>
+                <m:t>0.237</m:t>
               </m:r>
             </m:oMath>
             <w:r>
@@ -10477,7 +10477,7 @@
             </w:pPr>
             <m:oMath>
               <m:r>
-                <m:t>0.934</m:t>
+                <m:t>0.965</m:t>
               </m:r>
               <m:r>
                 <m:rPr>
@@ -10486,7 +10486,7 @@
                 <m:t>±</m:t>
               </m:r>
               <m:r>
-                <m:t>0.034</m:t>
+                <m:t>0.058</m:t>
               </m:r>
             </m:oMath>
             <w:r>
@@ -10506,7 +10506,7 @@
                 <w:b/>
                 <w:bCs/>
               </w:rPr>
-              <w:t xml:space="preserve">Prim 1.64x</w:t>
+              <w:t xml:space="preserve">Prim 1.73x</w:t>
             </w:r>
           </w:p>
         </w:tc>
@@ -10545,7 +10545,7 @@
             </w:pPr>
             <m:oMath>
               <m:r>
-                <m:t>2.432</m:t>
+                <m:t>1.627</m:t>
               </m:r>
               <m:r>
                 <m:rPr>
@@ -10554,7 +10554,7 @@
                 <m:t>±</m:t>
               </m:r>
               <m:r>
-                <m:t>0.722</m:t>
+                <m:t>0.124</m:t>
               </m:r>
             </m:oMath>
             <w:r>
@@ -10571,7 +10571,7 @@
             </w:pPr>
             <m:oMath>
               <m:r>
-                <m:t>2.055</m:t>
+                <m:t>1.549</m:t>
               </m:r>
               <m:r>
                 <m:rPr>
@@ -10580,7 +10580,7 @@
                 <m:t>±</m:t>
               </m:r>
               <m:r>
-                <m:t>0.462</m:t>
+                <m:t>0.163</m:t>
               </m:r>
             </m:oMath>
             <w:r>
@@ -10609,7 +10609,7 @@
             </w:pPr>
             <m:oMath>
               <m:r>
-                <m:t>6.836</m:t>
+                <m:t>6.980</m:t>
               </m:r>
               <m:r>
                 <m:rPr>
@@ -10618,7 +10618,7 @@
                 <m:t>±</m:t>
               </m:r>
               <m:r>
-                <m:t>0.903</m:t>
+                <m:t>0.652</m:t>
               </m:r>
             </m:oMath>
             <w:r>
@@ -10635,7 +10635,7 @@
             </w:pPr>
             <m:oMath>
               <m:r>
-                <m:t>3.012</m:t>
+                <m:t>3.176</m:t>
               </m:r>
               <m:r>
                 <m:rPr>
@@ -10644,7 +10644,7 @@
                 <m:t>±</m:t>
               </m:r>
               <m:r>
-                <m:t>0.147</m:t>
+                <m:t>0.238</m:t>
               </m:r>
             </m:oMath>
             <w:r>
@@ -10664,7 +10664,7 @@
                 <w:b/>
                 <w:bCs/>
               </w:rPr>
-              <w:t xml:space="preserve">Prim 2.27x</w:t>
+              <w:t xml:space="preserve">Prim 2.20x</w:t>
             </w:r>
           </w:p>
         </w:tc>
@@ -11068,7 +11068,7 @@
                 <m:rPr>
                   <m:sty m:val="p"/>
                 </m:rPr>
-                <m:t>∥</m:t>
+                <m:t>|</m:t>
               </m:r>
               <m:r>
                 <m:t>V</m:t>
@@ -11077,7 +11077,7 @@
                 <m:rPr>
                   <m:sty m:val="p"/>
                 </m:rPr>
-                <m:t>∥</m:t>
+                <m:t>|</m:t>
               </m:r>
             </m:oMath>
           </w:p>
@@ -11177,7 +11177,7 @@
             </w:pPr>
             <m:oMath>
               <m:r>
-                <m:t>0.022</m:t>
+                <m:t>0.028</m:t>
               </m:r>
               <m:r>
                 <m:rPr>
@@ -11186,7 +11186,7 @@
                 <m:t>±</m:t>
               </m:r>
               <m:r>
-                <m:t>0.007</m:t>
+                <m:t>0.011</m:t>
               </m:r>
             </m:oMath>
             <w:r>
@@ -11203,7 +11203,7 @@
             </w:pPr>
             <m:oMath>
               <m:r>
-                <m:t>0.018</m:t>
+                <m:t>0.022</m:t>
               </m:r>
               <m:r>
                 <m:rPr>
@@ -11212,7 +11212,7 @@
                 <m:t>±</m:t>
               </m:r>
               <m:r>
-                <m:t>0.003</m:t>
+                <m:t>0.004</m:t>
               </m:r>
             </m:oMath>
             <w:r>
@@ -11228,7 +11228,7 @@
               <w:jc w:val="center"/>
             </w:pPr>
             <w:r>
-              <w:t xml:space="preserve">BF 1.22x</w:t>
+              <w:t xml:space="preserve">BF 1.27x</w:t>
             </w:r>
           </w:p>
         </w:tc>
@@ -11241,7 +11241,7 @@
             </w:pPr>
             <m:oMath>
               <m:r>
-                <m:t>0.196</m:t>
+                <m:t>0.199</m:t>
               </m:r>
               <m:r>
                 <m:rPr>
@@ -11250,7 +11250,7 @@
                 <m:t>±</m:t>
               </m:r>
               <m:r>
-                <m:t>0.009</m:t>
+                <m:t>0.007</m:t>
               </m:r>
             </m:oMath>
             <w:r>
@@ -11276,7 +11276,7 @@
                 <m:t>±</m:t>
               </m:r>
               <m:r>
-                <m:t>0.007</m:t>
+                <m:t>0.005</m:t>
               </m:r>
             </m:oMath>
             <w:r>
@@ -11292,7 +11292,7 @@
               <w:jc w:val="center"/>
             </w:pPr>
             <w:r>
-              <w:t xml:space="preserve">FW 1.75x</w:t>
+              <w:t xml:space="preserve">FW 1.78x</w:t>
             </w:r>
           </w:p>
         </w:tc>
@@ -11319,7 +11319,7 @@
             </w:pPr>
             <m:oMath>
               <m:r>
-                <m:t>0.114</m:t>
+                <m:t>0.110</m:t>
               </m:r>
               <m:r>
                 <m:rPr>
@@ -11328,7 +11328,7 @@
                 <m:t>±</m:t>
               </m:r>
               <m:r>
-                <m:t>0.011</m:t>
+                <m:t>0.015</m:t>
               </m:r>
             </m:oMath>
             <w:r>
@@ -11354,7 +11354,7 @@
                 <m:t>±</m:t>
               </m:r>
               <m:r>
-                <m:t>0.006</m:t>
+                <m:t>0.013</m:t>
               </m:r>
             </m:oMath>
             <w:r>
@@ -11374,7 +11374,7 @@
                 <w:b/>
                 <w:bCs/>
               </w:rPr>
-              <w:t xml:space="preserve">Dijkstra 1.39x</w:t>
+              <w:t xml:space="preserve">Dijkstra 1.44x</w:t>
             </w:r>
           </w:p>
         </w:tc>
@@ -11387,7 +11387,7 @@
             </w:pPr>
             <m:oMath>
               <m:r>
-                <m:t>1.813</m:t>
+                <m:t>1.778</m:t>
               </m:r>
               <m:r>
                 <m:rPr>
@@ -11396,7 +11396,7 @@
                 <m:t>±</m:t>
               </m:r>
               <m:r>
-                <m:t>0.025</m:t>
+                <m:t>0.116</m:t>
               </m:r>
             </m:oMath>
             <w:r>
@@ -11413,7 +11413,7 @@
             </w:pPr>
             <m:oMath>
               <m:r>
-                <m:t>1.891</m:t>
+                <m:t>1.963</m:t>
               </m:r>
               <m:r>
                 <m:rPr>
@@ -11422,7 +11422,7 @@
                 <m:t>±</m:t>
               </m:r>
               <m:r>
-                <m:t>0.034</m:t>
+                <m:t>0.234</m:t>
               </m:r>
             </m:oMath>
             <w:r>
@@ -11442,7 +11442,7 @@
                 <w:b/>
                 <w:bCs/>
               </w:rPr>
-              <w:t xml:space="preserve">Tied (~1.0x)</w:t>
+              <w:t xml:space="preserve">RD 1.10x</w:t>
             </w:r>
           </w:p>
         </w:tc>
@@ -11469,7 +11469,7 @@
             </w:pPr>
             <m:oMath>
               <m:r>
-                <m:t>0.188</m:t>
+                <m:t>0.184</m:t>
               </m:r>
               <m:r>
                 <m:rPr>
@@ -11478,7 +11478,7 @@
                 <m:t>±</m:t>
               </m:r>
               <m:r>
-                <m:t>0.006</m:t>
+                <m:t>0.002</m:t>
               </m:r>
             </m:oMath>
             <w:r>
@@ -11495,7 +11495,7 @@
             </w:pPr>
             <m:oMath>
               <m:r>
-                <m:t>0.449</m:t>
+                <m:t>0.444</m:t>
               </m:r>
               <m:r>
                 <m:rPr>
@@ -11504,7 +11504,7 @@
                 <m:t>±</m:t>
               </m:r>
               <m:r>
-                <m:t>0.019</m:t>
+                <m:t>0.010</m:t>
               </m:r>
             </m:oMath>
             <w:r>
@@ -11524,7 +11524,7 @@
                 <w:b/>
                 <w:bCs/>
               </w:rPr>
-              <w:t xml:space="preserve">Dijkstra 2.39x</w:t>
+              <w:t xml:space="preserve">Dijkstra 2.41x</w:t>
             </w:r>
           </w:p>
         </w:tc>
@@ -11537,7 +11537,7 @@
             </w:pPr>
             <m:oMath>
               <m:r>
-                <m:t>14.276</m:t>
+                <m:t>14.720</m:t>
               </m:r>
               <m:r>
                 <m:rPr>
@@ -11546,7 +11546,7 @@
                 <m:t>±</m:t>
               </m:r>
               <m:r>
-                <m:t>0.099</m:t>
+                <m:t>0.259</m:t>
               </m:r>
             </m:oMath>
             <w:r>
@@ -11563,7 +11563,7 @@
             </w:pPr>
             <m:oMath>
               <m:r>
-                <m:t>30.818</m:t>
+                <m:t>32.403</m:t>
               </m:r>
               <m:r>
                 <m:rPr>
@@ -11572,7 +11572,7 @@
                 <m:t>±</m:t>
               </m:r>
               <m:r>
-                <m:t>0.480</m:t>
+                <m:t>0.858</m:t>
               </m:r>
             </m:oMath>
             <w:r>
@@ -11592,7 +11592,7 @@
                 <w:b/>
                 <w:bCs/>
               </w:rPr>
-              <w:t xml:space="preserve">RD 2.16x</w:t>
+              <w:t xml:space="preserve">RD 2.20x</w:t>
             </w:r>
           </w:p>
         </w:tc>
@@ -11619,7 +11619,7 @@
             </w:pPr>
             <m:oMath>
               <m:r>
-                <m:t>0.511</m:t>
+                <m:t>0.505</m:t>
               </m:r>
               <m:r>
                 <m:rPr>
@@ -11628,7 +11628,7 @@
                 <m:t>±</m:t>
               </m:r>
               <m:r>
-                <m:t>0.044</m:t>
+                <m:t>0.023</m:t>
               </m:r>
             </m:oMath>
             <w:r>
@@ -11645,7 +11645,7 @@
             </w:pPr>
             <m:oMath>
               <m:r>
-                <m:t>1.518</m:t>
+                <m:t>1.562</m:t>
               </m:r>
               <m:r>
                 <m:rPr>
@@ -11654,7 +11654,7 @@
                 <m:t>±</m:t>
               </m:r>
               <m:r>
-                <m:t>0.090</m:t>
+                <m:t>0.122</m:t>
               </m:r>
             </m:oMath>
             <w:r>
@@ -11674,7 +11674,7 @@
                 <w:b/>
                 <w:bCs/>
               </w:rPr>
-              <w:t xml:space="preserve">Dijkstra 2.97x</w:t>
+              <w:t xml:space="preserve">Dijkstra 3.09x</w:t>
             </w:r>
           </w:p>
         </w:tc>
@@ -11687,7 +11687,7 @@
             </w:pPr>
             <m:oMath>
               <m:r>
-                <m:t>29.582</m:t>
+                <m:t>33.097</m:t>
               </m:r>
               <m:r>
                 <m:rPr>
@@ -11696,7 +11696,7 @@
                 <m:t>±</m:t>
               </m:r>
               <m:r>
-                <m:t>0.633</m:t>
+                <m:t>2.784</m:t>
               </m:r>
             </m:oMath>
             <w:r>
@@ -11713,7 +11713,7 @@
             </w:pPr>
             <m:oMath>
               <m:r>
-                <m:t>77.847</m:t>
+                <m:t>89.706</m:t>
               </m:r>
               <m:r>
                 <m:rPr>
@@ -11722,7 +11722,7 @@
                 <m:t>±</m:t>
               </m:r>
               <m:r>
-                <m:t>2.445</m:t>
+                <m:t>8.388</m:t>
               </m:r>
             </m:oMath>
             <w:r>
@@ -11742,7 +11742,7 @@
                 <w:b/>
                 <w:bCs/>
               </w:rPr>
-              <w:t xml:space="preserve">RD 2.63x</w:t>
+              <w:t xml:space="preserve">RD 2.71x</w:t>
             </w:r>
           </w:p>
         </w:tc>
@@ -12363,7 +12363,7 @@
                 <m:t>+</m:t>
               </m:r>
               <m:r>
-                <m:t>32.52</m:t>
+                <m:t>32.41</m:t>
               </m:r>
               <m:r>
                 <m:rPr>
@@ -12372,7 +12372,7 @@
                 <m:t>±</m:t>
               </m:r>
               <m:r>
-                <m:t>12.76</m:t>
+                <m:t>12.71</m:t>
               </m:r>
               <m:sSup>
                 <m:e>
@@ -12967,7 +12967,7 @@
                 <m:t>±</m:t>
               </m:r>
               <m:r>
-                <m:t>2.95</m:t>
+                <m:t>2.94</m:t>
               </m:r>
               <m:r>
                 <m:rPr>
@@ -13389,7 +13389,7 @@
       </w:r>
       <m:oMath>
         <m:r>
-          <m:t>25.27</m:t>
+          <m:t>25.24</m:t>
         </m:r>
         <m:r>
           <m:t> </m:t>
@@ -13434,6 +13434,37 @@
             <m:nor/>
           </m:rPr>
           <m:t>ms</m:t>
+        </m:r>
+      </m:oMath>
+      <w:r>
+        <w:rPr>
+          <w:i/>
+          <w:iCs/>
+        </w:rPr>
+        <w:t xml:space="preserve">,</w:t>
+      </w:r>
+      <w:r>
+        <w:rPr>
+          <w:i/>
+          <w:iCs/>
+        </w:rPr>
+        <w:t xml:space="preserve"> </w:t>
+      </w:r>
+      <m:oMath>
+        <m:r>
+          <m:rPr>
+            <m:sty m:val="p"/>
+          </m:rPr>
+          <m:t>+</m:t>
+        </m:r>
+        <m:r>
+          <m:t>32.41</m:t>
+        </m:r>
+        <m:r>
+          <m:rPr>
+            <m:sty m:val="p"/>
+          </m:rPr>
+          <m:t>%</m:t>
         </m:r>
       </m:oMath>
       <w:r>
@@ -13608,7 +13639,7 @@
         </m:r>
       </m:oMath>
       <w:r>
-        <w:t xml:space="preserve">). In our multi-round bidding loop, each server receives 2–5 proposals per round, making greedy ratio choices closely mirror 0-1 knapsack selections.</w:t>
+        <w:t xml:space="preserve">). In our multi-round bidding loop, only a small subset of candidate tasks competes for any given server in each round (typically 1 to 4 competing proposals per active server, median 2), making greedy ratio choices closely mirror 0-1 knapsack selections.</w:t>
       </w:r>
       <w:r>
         <w:t xml:space="preserve"> </w:t>
@@ -13627,7 +13658,7 @@
         <w:t xml:space="preserve">Both Multi-Round Schedulers Outperform Spill-Over Greedy</w:t>
       </w:r>
       <w:r>
-        <w:t xml:space="preserve">: Coordinated regret-based bidding prevents high-traffic tasks from greedily occupying servers required by low-traffic tasks, beating Spill-Over Greedy (</w:t>
+        <w:t xml:space="preserve">: Coordinated regret-based bidding prevents high-traffic tasks from greedily occupying servers required by low-traffic tasks, beating Spill-Over Greedy on most seeds (</w:t>
       </w:r>
       <m:oMath>
         <m:r>
@@ -13644,6 +13675,26 @@
         <w:t xml:space="preserve"> </w:t>
       </w:r>
       <w:r>
+        <w:t xml:space="preserve">vs</w:t>
+      </w:r>
+      <w:r>
+        <w:t xml:space="preserve"> </w:t>
+      </w:r>
+      <m:oMath>
+        <m:r>
+          <m:t>6.41</m:t>
+        </m:r>
+        <m:r>
+          <m:rPr>
+            <m:sty m:val="p"/>
+          </m:rPr>
+          <m:t>%</m:t>
+        </m:r>
+      </m:oMath>
+      <w:r>
+        <w:t xml:space="preserve"> </w:t>
+      </w:r>
+      <w:r>
         <w:t xml:space="preserve">at</w:t>
       </w:r>
       <w:r>
@@ -13681,6 +13732,26 @@
         <w:t xml:space="preserve"> </w:t>
       </w:r>
       <w:r>
+        <w:t xml:space="preserve">vs</w:t>
+      </w:r>
+      <w:r>
+        <w:t xml:space="preserve"> </w:t>
+      </w:r>
+      <m:oMath>
+        <m:r>
+          <m:t>1.74</m:t>
+        </m:r>
+        <m:r>
+          <m:rPr>
+            <m:sty m:val="p"/>
+          </m:rPr>
+          <m:t>%</m:t>
+        </m:r>
+      </m:oMath>
+      <w:r>
+        <w:t xml:space="preserve"> </w:t>
+      </w:r>
+      <w:r>
         <w:t xml:space="preserve">at</w:t>
       </w:r>
       <w:r>
@@ -13689,6 +13760,43 @@
       <m:oMath>
         <m:r>
           <m:t>2.0</m:t>
+        </m:r>
+        <m:r>
+          <m:rPr>
+            <m:sty m:val="p"/>
+          </m:rPr>
+          <m:t>×</m:t>
+        </m:r>
+      </m:oMath>
+      <w:r>
+        <w:t xml:space="preserve">; DP beats Spill-Over on 9 of 10 seeds at</w:t>
+      </w:r>
+      <w:r>
+        <w:t xml:space="preserve"> </w:t>
+      </w:r>
+      <m:oMath>
+        <m:r>
+          <m:t>1.0</m:t>
+        </m:r>
+        <m:r>
+          <m:rPr>
+            <m:sty m:val="p"/>
+          </m:rPr>
+          <m:t>×</m:t>
+        </m:r>
+      </m:oMath>
+      <w:r>
+        <w:t xml:space="preserve"> </w:t>
+      </w:r>
+      <w:r>
+        <w:t xml:space="preserve">capacity, and 8 of 10 seeds at</w:t>
+      </w:r>
+      <w:r>
+        <w:t xml:space="preserve"> </w:t>
+      </w:r>
+      <m:oMath>
+        <m:r>
+          <m:t>0.75</m:t>
         </m:r>
         <m:r>
           <m:rPr>
@@ -15996,7 +16104,7 @@
       <w:r>
         <w:drawing>
           <wp:inline>
-            <wp:extent cx="3474719" cy="2405575"/>
+            <wp:extent cx="3474719" cy="2481942"/>
             <wp:effectExtent b="0" l="0" r="0" t="0"/>
             <wp:docPr descr="Placement Sensitivity Combined" title="" id="43" name="Picture"/>
             <a:graphic>
@@ -16017,7 +16125,7 @@
                   <pic:spPr bwMode="auto">
                     <a:xfrm>
                       <a:off x="0" y="0"/>
-                      <a:ext cx="3474719" cy="2405575"/>
+                      <a:ext cx="3474719" cy="2481942"/>
                     </a:xfrm>
                     <a:prstGeom prst="rect">
                       <a:avLst/>
@@ -17984,7 +18092,7 @@
       </w:r>
       <m:oMath>
         <m:r>
-          <m:t>2.63</m:t>
+          <m:t>2.71</m:t>
         </m:r>
         <m:r>
           <m:rPr>
@@ -18050,7 +18158,7 @@
       </w:r>
       <m:oMath>
         <m:r>
-          <m:t>29.58</m:t>
+          <m:t>33.10</m:t>
         </m:r>
         <m:r>
           <m:t> </m:t>
@@ -18073,7 +18181,7 @@
       </w:r>
       <m:oMath>
         <m:r>
-          <m:t>77.85</m:t>
+          <m:t>89.71</m:t>
         </m:r>
         <m:r>
           <m:t> </m:t>
@@ -18112,7 +18220,7 @@
       </w:r>
       <m:oMath>
         <m:r>
-          <m:t>1.51</m:t>
+          <m:t>1.56</m:t>
         </m:r>
         <m:r>
           <m:rPr>
@@ -18164,7 +18272,7 @@
       </w:r>
       <m:oMath>
         <m:r>
-          <m:t>56.74</m:t>
+          <m:t>59.47</m:t>
         </m:r>
         <m:r>
           <m:t> </m:t>
@@ -18187,7 +18295,7 @@
       </w:r>
       <m:oMath>
         <m:r>
-          <m:t>85.66</m:t>
+          <m:t>93.00</m:t>
         </m:r>
         <m:r>
           <m:t> </m:t>
@@ -18396,7 +18504,7 @@
       </w:r>
       <m:oMath>
         <m:r>
-          <m:t>0.196</m:t>
+          <m:t>0.199</m:t>
         </m:r>
         <m:r>
           <m:t> </m:t>
@@ -18481,7 +18589,7 @@
           <m:t>±</m:t>
         </m:r>
         <m:r>
-          <m:t>2.95</m:t>
+          <m:t>2.94</m:t>
         </m:r>
         <m:r>
           <m:rPr>
@@ -18601,7 +18709,7 @@
         </m:r>
       </m:oMath>
       <w:r>
-        <w:t xml:space="preserve">). In our multi-round architecture, 0-1 Knapsack DP is exact only per server per round on the local regret benefit, not globally across the entire fleet assignment. Because each server receives small sets of competing proposals per round (typically 2–5 tasks), sorting by greedy regret-to-demand ratio yields essentially identical assignment decisions as exact local 0-1 knapsack branches. Both multi-round bidding models outperform uncoordinated Spill-Over Greedy (</w:t>
+        <w:t xml:space="preserve">). In our multi-round architecture, 0-1 Knapsack DP is exact only per server per round on the local regret benefit, not globally across the entire fleet assignment. Because each server receives small sets of competing proposals per round (typically 1 to 4 tasks, median 2), sorting by greedy regret-to-demand ratio yields essentially identical assignment decisions as exact local 0-1 knapsack branches. Both multi-round bidding models outperform uncoordinated Spill-Over Greedy (</w:t>
       </w:r>
       <m:oMath>
         <m:r>
@@ -18699,7 +18807,7 @@
       </w:r>
       <m:oMath>
         <m:r>
-          <m:t>0.57</m:t>
+          <m:t>0.56</m:t>
         </m:r>
         <m:r>
           <m:rPr>
@@ -18778,6 +18886,26 @@
         </m:r>
         <m:r>
           <m:t>1.0</m:t>
+        </m:r>
+        <m:r>
+          <m:rPr>
+            <m:sty m:val="p"/>
+          </m:rPr>
+          <m:t>×</m:t>
+        </m:r>
+      </m:oMath>
+      <w:r>
+        <w:t xml:space="preserve"> </w:t>
+      </w:r>
+      <w:r>
+        <w:t xml:space="preserve">to</w:t>
+      </w:r>
+      <w:r>
+        <w:t xml:space="preserve"> </w:t>
+      </w:r>
+      <m:oMath>
+        <m:r>
+          <m:t>1.1</m:t>
         </m:r>
         <m:r>
           <m:rPr>
@@ -18855,7 +18983,7 @@
       </w:r>
       <m:oMath>
         <m:r>
-          <m:t>1.58</m:t>
+          <m:t>1.64</m:t>
         </m:r>
         <m:r>
           <m:rPr>
@@ -18905,7 +19033,7 @@
           <m:t>→</m:t>
         </m:r>
         <m:r>
-          <m:t>2.63</m:t>
+          <m:t>2.71</m:t>
         </m:r>
         <m:r>
           <m:rPr>
@@ -19053,7 +19181,7 @@
           <m:t>→</m:t>
         </m:r>
         <m:r>
-          <m:t>1.51</m:t>
+          <m:t>1.56</m:t>
         </m:r>
         <m:r>
           <m:rPr>
@@ -19547,7 +19675,44 @@
         <w:t xml:space="preserve">Use Regret-Based Proposal Scheduling</w:t>
       </w:r>
       <w:r>
-        <w:t xml:space="preserve">: Multi-round regret bidding consistently beats simple spill-over scheduling by ensuring tasks facing high displacement penalties secure appropriate hosts first.</w:t>
+        <w:t xml:space="preserve">: Multi-round regret bidding beats simple spill-over scheduling on most seeds (e.g., DP beats Spill-Over Greedy on 9 of 10 seeds at</w:t>
+      </w:r>
+      <w:r>
+        <w:t xml:space="preserve"> </w:t>
+      </w:r>
+      <m:oMath>
+        <m:r>
+          <m:t>1.0</m:t>
+        </m:r>
+        <m:r>
+          <m:rPr>
+            <m:sty m:val="p"/>
+          </m:rPr>
+          <m:t>×</m:t>
+        </m:r>
+      </m:oMath>
+      <w:r>
+        <w:t xml:space="preserve"> </w:t>
+      </w:r>
+      <w:r>
+        <w:t xml:space="preserve">capacity, and 8 of 10 seeds at</w:t>
+      </w:r>
+      <w:r>
+        <w:t xml:space="preserve"> </w:t>
+      </w:r>
+      <m:oMath>
+        <m:r>
+          <m:t>0.75</m:t>
+        </m:r>
+        <m:r>
+          <m:rPr>
+            <m:sty m:val="p"/>
+          </m:rPr>
+          <m:t>×</m:t>
+        </m:r>
+      </m:oMath>
+      <w:r>
+        <w:t xml:space="preserve">) by ensuring tasks facing high displacement penalties secure appropriate hosts first.</w:t>
       </w:r>
     </w:p>
     <w:p>
@@ -19936,7 +20101,7 @@
       </w:r>
       <m:oMath>
         <m:r>
-          <m:t>41</m:t>
+          <m:t>42.9</m:t>
         </m:r>
         <m:r>
           <m:rPr>
@@ -19968,7 +20133,7 @@
       </w:r>
       <m:oMath>
         <m:r>
-          <m:t>46</m:t>
+          <m:t>45.3</m:t>
         </m:r>
         <m:r>
           <m:rPr>
@@ -19992,7 +20157,47 @@
         <w:t xml:space="preserve">above the lower bound</w:t>
       </w:r>
       <w:r>
-        <w:t xml:space="preserve">, iterative knapsack DP stays within</w:t>
+        <w:t xml:space="preserve"> </w:t>
+      </w:r>
+      <w:r>
+        <w:t xml:space="preserve">(</w:t>
+      </w:r>
+      <m:oMath>
+        <m:r>
+          <m:t>42.3</m:t>
+        </m:r>
+        <m:r>
+          <m:rPr>
+            <m:sty m:val="p"/>
+          </m:rPr>
+          <m:t>%</m:t>
+        </m:r>
+      </m:oMath>
+      <w:r>
+        <w:t xml:space="preserve"> </w:t>
+      </w:r>
+      <w:r>
+        <w:t xml:space="preserve">to</w:t>
+      </w:r>
+      <w:r>
+        <w:t xml:space="preserve"> </w:t>
+      </w:r>
+      <m:oMath>
+        <m:r>
+          <m:t>44.6</m:t>
+        </m:r>
+        <m:r>
+          <m:rPr>
+            <m:sty m:val="p"/>
+          </m:rPr>
+          <m:t>%</m:t>
+        </m:r>
+      </m:oMath>
+      <w:r>
+        <w:t xml:space="preserve"> </w:t>
+      </w:r>
+      <w:r>
+        <w:t xml:space="preserve">in access latency), iterative knapsack DP stays within</w:t>
       </w:r>
       <w:r>
         <w:t xml:space="preserve"> </w:t>

</xml_diff>